<commit_message>
removed name from doc
</commit_message>
<xml_diff>
--- a/apps/triage/FullDoc.docx
+++ b/apps/triage/FullDoc.docx
@@ -1160,24 +1160,6 @@
                 <w14:ligatures w14:val="none"/>
               </w:rPr>
             </w:pPr>
-            <w:r>
-              <w:rPr>
-                <w:rFonts w:ascii="Aptos" w:eastAsia="Times New Roman" w:hAnsi="Aptos" w:cs="Times New Roman"/>
-                <w:kern w:val="0"/>
-                <w:lang w:eastAsia="en-GB"/>
-                <w14:ligatures w14:val="none"/>
-              </w:rPr>
-              <w:t> </w:t>
-            </w:r>
-            <w:r>
-              <w:rPr>
-                <w:rFonts w:ascii="Aptos" w:eastAsia="Times New Roman" w:hAnsi="Aptos" w:cs="Times New Roman"/>
-                <w:kern w:val="0"/>
-                <w:lang w:eastAsia="en-GB"/>
-                <w14:ligatures w14:val="none"/>
-              </w:rPr>
-              <w:t>Santa Paws</w:t>
-            </w:r>
           </w:p>
         </w:tc>
       </w:tr>
@@ -1435,15 +1417,6 @@
                 <w14:ligatures w14:val="none"/>
               </w:rPr>
               <w:t> </w:t>
-            </w:r>
-            <w:r>
-              <w:rPr>
-                <w:rFonts w:ascii="Aptos" w:eastAsia="Times New Roman" w:hAnsi="Aptos" w:cs="Times New Roman"/>
-                <w:kern w:val="0"/>
-                <w:lang w:eastAsia="en-GB"/>
-                <w14:ligatures w14:val="none"/>
-              </w:rPr>
-              <w:t>Elf Number 3</w:t>
             </w:r>
           </w:p>
         </w:tc>
@@ -1725,24 +1698,6 @@
                 <w14:ligatures w14:val="none"/>
               </w:rPr>
             </w:pPr>
-            <w:r>
-              <w:rPr>
-                <w:rFonts w:ascii="Aptos" w:eastAsia="Times New Roman" w:hAnsi="Aptos" w:cs="Times New Roman"/>
-                <w:kern w:val="0"/>
-                <w:lang w:eastAsia="en-GB"/>
-                <w14:ligatures w14:val="none"/>
-              </w:rPr>
-              <w:t> </w:t>
-            </w:r>
-            <w:r>
-              <w:rPr>
-                <w:rFonts w:ascii="Aptos" w:eastAsia="Times New Roman" w:hAnsi="Aptos" w:cs="Times New Roman"/>
-                <w:kern w:val="0"/>
-                <w:lang w:eastAsia="en-GB"/>
-                <w14:ligatures w14:val="none"/>
-              </w:rPr>
-              <w:t>Liono</w:t>
-            </w:r>
           </w:p>
         </w:tc>
       </w:tr>

</xml_diff>